<commit_message>
feat: update internship at Amazing Tech and add ftacode projects
</commit_message>
<xml_diff>
--- a/doc/CV_Nguyen_Hoang_Huy_VI.docx
+++ b/doc/CV_Nguyen_Hoang_Huy_VI.docx
@@ -39,7 +39,15 @@
           <w:bCs/>
           <w:color w:val="378ADD"/>
         </w:rPr>
-        <w:t>Lập trình viên Backend / Frontend · DevOps · Sinh viên Kỹ thuật Phần mềm · Đại học FPT</w:t>
+        <w:t xml:space="preserve">Ứng tuyển CTV Triển khai phần mềm ORDERSYS </w:t>
+      </w:r>
+      <w:r>
+        <w:rPr>
+          <w:b/>
+          <w:bCs/>
+          <w:color w:val="378ADD"/>
+        </w:rPr>
+        <w:t>· Sinh viên Kỹ thuật Phần mềm · Đại học FPT</w:t>
       </w:r>
     </w:p>
     <w:p>
@@ -60,7 +68,31 @@
           <w:sz w:val="18"/>
           <w:szCs w:val="18"/>
         </w:rPr>
-        <w:t xml:space="preserve">TP. Hồ Chí Minh, Việt Nam   ·   +84 366 424 978   ·   </w:t>
+        <w:t xml:space="preserve">Thủ Đức, </w:t>
+      </w:r>
+      <w:r>
+        <w:rPr>
+          <w:color w:val="5F6B7A"/>
+          <w:sz w:val="18"/>
+          <w:szCs w:val="18"/>
+        </w:rPr>
+        <w:t xml:space="preserve">TP. Hồ Chí Minh, Việt Nam   ·   +84 </w:t>
+      </w:r>
+      <w:r>
+        <w:rPr>
+          <w:color w:val="5F6B7A"/>
+          <w:sz w:val="18"/>
+          <w:szCs w:val="18"/>
+        </w:rPr>
+        <w:t>378 868 159</w:t>
+      </w:r>
+      <w:r>
+        <w:rPr>
+          <w:color w:val="5F6B7A"/>
+          <w:sz w:val="18"/>
+          <w:szCs w:val="18"/>
+        </w:rPr>
+        <w:t xml:space="preserve">   ·   </w:t>
       </w:r>
       <w:hyperlink r:id="rId5" w:history="1">
         <w:r>
@@ -133,43 +165,23 @@
     </w:p>
     <w:p>
       <w:pPr>
-        <w:spacing w:after="220"/>
-        <w:rPr>
-          <w:sz w:val="32"/>
-          <w:szCs w:val="32"/>
-        </w:rPr>
-      </w:pPr>
-      <w:r>
+        <w:pBdr>
+          <w:bottom w:val="single" w:sz="4" w:space="4" w:color="DFE7F0"/>
+        </w:pBdr>
+        <w:spacing w:before="300" w:after="160"/>
         <w:rPr>
           <w:color w:val="2A3A4A"/>
-          <w:sz w:val="24"/>
-          <w:szCs w:val="24"/>
-        </w:rPr>
-        <w:t xml:space="preserve">Sinh viên năm 3 ngành Kỹ thuật Phần mềm, định hướng phát triển theo hướng Fullstack Developer và DevOps. Có kinh nghiệm thực tế xây dựng và vận hành hệ thống cho một doanh nghiệp nhỏ trong môi trường vận hành thực tế </w:t>
-      </w:r>
+          <w:sz w:val="22"/>
+          <w:szCs w:val="22"/>
+        </w:rPr>
+      </w:pPr>
       <w:r>
         <w:rPr>
           <w:color w:val="2A3A4A"/>
-          <w:sz w:val="24"/>
-          <w:szCs w:val="24"/>
-        </w:rPr>
-        <w:t>-</w:t>
-      </w:r>
-      <w:r>
-        <w:rPr>
-          <w:color w:val="2A3A4A"/>
-          <w:sz w:val="24"/>
-          <w:szCs w:val="24"/>
-        </w:rPr>
-        <w:t xml:space="preserve"> </w:t>
-      </w:r>
-      <w:r>
-        <w:rPr>
-          <w:color w:val="2A3A4A"/>
-          <w:sz w:val="24"/>
-          <w:szCs w:val="24"/>
-        </w:rPr>
-        <w:t>phụ trách từ thiết kế, phát triển backend/frontend đến quản trị server.</w:t>
+          <w:sz w:val="22"/>
+          <w:szCs w:val="22"/>
+        </w:rPr>
+        <w:t>Sinh viên năm 3 ngành Kỹ thuật Phần mềm tại Đại học FPT, hiện sinh sống tại Thủ Đức, TP. Hồ Chí Minh. Có nền tảng về cài đặt và cấu hình phần mềm, kiểm tra hệ thống, mạng LAN/Wi-Fi cơ bản, cơ sở dữ liệu và triển khai ứng dụng thực tế. Mong muốn trở thành CTV Triển khai ORDERSYS để hỗ trợ khách hàng cài đặt phần mềm, kiểm tra thiết bị, hướng dẫn sử dụng, test quy trình vận hành và ghi nhận sự cố kỹ thuật theo checklist của công ty.</w:t>
       </w:r>
     </w:p>
     <w:p>
@@ -803,90 +815,12 @@
         <w:t>.</w:t>
       </w:r>
     </w:p>
-    <w:tbl>
-      <w:tblPr>
-        <w:tblW w:w="9360" w:type="dxa"/>
-        <w:tblCellMar>
-          <w:left w:w="10" w:type="dxa"/>
-          <w:right w:w="10" w:type="dxa"/>
-        </w:tblCellMar>
-        <w:tblLook w:val="0000" w:firstRow="0" w:lastRow="0" w:firstColumn="0" w:lastColumn="0" w:noHBand="0" w:noVBand="0"/>
-      </w:tblPr>
-      <w:tblGrid>
-        <w:gridCol w:w="6800"/>
-        <w:gridCol w:w="2560"/>
-      </w:tblGrid>
-      <w:tr>
-        <w:tc>
-          <w:tcPr>
-            <w:tcW w:w="6800" w:type="dxa"/>
-            <w:tcMar>
-              <w:top w:w="0" w:type="dxa"/>
-              <w:left w:w="0" w:type="dxa"/>
-              <w:bottom w:w="0" w:type="dxa"/>
-              <w:right w:w="0" w:type="dxa"/>
-            </w:tcMar>
-          </w:tcPr>
-          <w:p>
-            <w:pPr>
-              <w:rPr>
-                <w:sz w:val="22"/>
-                <w:szCs w:val="22"/>
-              </w:rPr>
-            </w:pPr>
-            <w:r>
-              <w:rPr>
-                <w:rFonts w:ascii="Arial" w:eastAsia="Arial" w:hAnsi="Arial" w:cs="Arial"/>
-                <w:b/>
-                <w:bCs/>
-                <w:color w:val="042C53"/>
-              </w:rPr>
-              <w:t>Lập trình viên Backend · Dự án nhóm</w:t>
-            </w:r>
-            <w:r>
-              <w:rPr>
-                <w:rFonts w:ascii="Arial" w:eastAsia="Arial" w:hAnsi="Arial" w:cs="Arial"/>
-                <w:b/>
-                <w:bCs/>
-                <w:color w:val="042C53"/>
-              </w:rPr>
-              <w:t xml:space="preserve"> môn học</w:t>
-            </w:r>
-          </w:p>
-        </w:tc>
-        <w:tc>
-          <w:tcPr>
-            <w:tcW w:w="2560" w:type="dxa"/>
-            <w:tcMar>
-              <w:top w:w="0" w:type="dxa"/>
-              <w:left w:w="0" w:type="dxa"/>
-              <w:bottom w:w="0" w:type="dxa"/>
-              <w:right w:w="0" w:type="dxa"/>
-            </w:tcMar>
-          </w:tcPr>
-          <w:p>
-            <w:pPr>
-              <w:jc w:val="right"/>
-              <w:rPr>
-                <w:sz w:val="22"/>
-                <w:szCs w:val="22"/>
-              </w:rPr>
-            </w:pPr>
-            <w:r>
-              <w:rPr>
-                <w:color w:val="5F6B7A"/>
-                <w:sz w:val="18"/>
-                <w:szCs w:val="18"/>
-              </w:rPr>
-              <w:t>05/2026</w:t>
-            </w:r>
-          </w:p>
-        </w:tc>
-      </w:tr>
-    </w:tbl>
-    <w:p>
-      <w:pPr>
-        <w:spacing w:before="40" w:after="100"/>
+    <w:p>
+      <w:pPr>
+        <w:pBdr>
+          <w:bottom w:val="single" w:sz="4" w:space="4" w:color="DFE7F0"/>
+        </w:pBdr>
+        <w:spacing w:before="300" w:after="160"/>
         <w:rPr>
           <w:sz w:val="22"/>
           <w:szCs w:val="22"/>
@@ -894,25 +828,42 @@
       </w:pPr>
       <w:r>
         <w:rPr>
+          <w:rFonts w:ascii="Arial" w:eastAsia="Arial" w:hAnsi="Arial" w:cs="Arial"/>
           <w:b/>
           <w:bCs/>
           <w:color w:val="378ADD"/>
           <w:sz w:val="18"/>
           <w:szCs w:val="18"/>
         </w:rPr>
-        <w:t xml:space="preserve">AutoWash Pro </w:t>
-      </w:r>
-      <w:r>
-        <w:rPr>
+        <w:t>3</w:t>
+      </w:r>
+      <w:r>
+        <w:rPr>
+          <w:rFonts w:ascii="Arial" w:eastAsia="Arial" w:hAnsi="Arial" w:cs="Arial"/>
           <w:b/>
           <w:bCs/>
           <w:color w:val="378ADD"/>
           <w:sz w:val="18"/>
           <w:szCs w:val="18"/>
         </w:rPr>
-        <w:t>-</w:t>
-      </w:r>
-      <w:r>
+        <w:t xml:space="preserve">. </w:t>
+      </w:r>
+      <w:r>
+        <w:rPr>
+          <w:rFonts w:ascii="Arial" w:eastAsia="Arial" w:hAnsi="Arial" w:cs="Arial"/>
+          <w:b/>
+          <w:bCs/>
+          <w:color w:val="042C53"/>
+          <w:spacing w:val="20"/>
+          <w:sz w:val="18"/>
+          <w:szCs w:val="18"/>
+        </w:rPr>
+        <w:t>KỸ NĂNG PHÙ HỢP</w:t>
+      </w:r>
+    </w:p>
+    <w:p>
+      <w:pPr>
+        <w:spacing w:after="60"/>
         <w:rPr>
           <w:b/>
           <w:bCs/>
@@ -920,8 +871,7 @@
           <w:sz w:val="18"/>
           <w:szCs w:val="18"/>
         </w:rPr>
-        <w:t>Hệ thống đặt lịch rửa xe tự động · SWP</w:t>
-      </w:r>
+      </w:pPr>
       <w:r>
         <w:rPr>
           <w:b/>
@@ -930,17 +880,7 @@
           <w:sz w:val="18"/>
           <w:szCs w:val="18"/>
         </w:rPr>
-        <w:t>391</w:t>
-      </w:r>
-      <w:r>
-        <w:rPr>
-          <w:b/>
-          <w:bCs/>
-          <w:color w:val="378ADD"/>
-          <w:sz w:val="18"/>
-          <w:szCs w:val="18"/>
-        </w:rPr>
-        <w:t xml:space="preserve"> · Đại học FPT</w:t>
+        <w:t>Cài đặt, kiểm tra và hỗ trợ kỹ thuật</w:t>
       </w:r>
     </w:p>
     <w:p>
@@ -951,18 +891,12 @@
           <w:numId w:val="2"/>
         </w:numPr>
         <w:spacing w:after="60"/>
-        <w:rPr>
-          <w:sz w:val="22"/>
-          <w:szCs w:val="22"/>
-        </w:rPr>
       </w:pPr>
       <w:r>
         <w:rPr>
           <w:color w:val="2A3A4A"/>
-          <w:sz w:val="18"/>
-          <w:szCs w:val="18"/>
-        </w:rPr>
-        <w:t>Đóng góp với vai trò lập trình viên backend trong dự án nhóm xây dựng hệ thống đặt lịch rửa xe tự động.</w:t>
+        </w:rPr>
+        <w:t xml:space="preserve">Cài đặt, cấu hình và kiểm tra phần mềm trên máy tính/laptop. </w:t>
       </w:r>
     </w:p>
     <w:p>
@@ -973,36 +907,9 @@
           <w:numId w:val="2"/>
         </w:numPr>
         <w:spacing w:after="60"/>
-        <w:rPr>
-          <w:sz w:val="22"/>
-          <w:szCs w:val="22"/>
-        </w:rPr>
-      </w:pPr>
-      <w:r>
-        <w:rPr>
-          <w:color w:val="2A3A4A"/>
-          <w:sz w:val="18"/>
-          <w:szCs w:val="18"/>
-        </w:rPr>
-        <w:t xml:space="preserve">Thiết kế và triển khai RESTful API bằng </w:t>
-      </w:r>
-      <w:r>
-        <w:rPr>
-          <w:b/>
-          <w:bCs/>
-          <w:color w:val="2A3A4A"/>
-          <w:sz w:val="18"/>
-          <w:szCs w:val="18"/>
-        </w:rPr>
-        <w:t>ASP.NET Core Web API</w:t>
-      </w:r>
-      <w:r>
-        <w:rPr>
-          <w:color w:val="2A3A4A"/>
-          <w:sz w:val="18"/>
-          <w:szCs w:val="18"/>
-        </w:rPr>
-        <w:t xml:space="preserve"> cho quản lý đặt lịch, danh mục dịch vụ và logic lên lịch.</w:t>
+      </w:pPr>
+      <w:r>
+        <w:t>Kiểm tra kết nối mạng cơ bản: Wi-Fi, LAN, IP và kết nối thiết bị trong mạng nội bộ.</w:t>
       </w:r>
     </w:p>
     <w:p>
@@ -1013,30 +920,49 @@
           <w:numId w:val="2"/>
         </w:numPr>
         <w:spacing w:after="60"/>
-        <w:rPr>
-          <w:sz w:val="22"/>
-          <w:szCs w:val="22"/>
-        </w:rPr>
-      </w:pPr>
-      <w:r>
-        <w:rPr>
-          <w:color w:val="2A3A4A"/>
-          <w:sz w:val="18"/>
-          <w:szCs w:val="18"/>
-        </w:rPr>
-        <w:t xml:space="preserve">Mã nguồn: </w:t>
-      </w:r>
-      <w:hyperlink r:id="rId10" w:history="1">
-        <w:r>
-          <w:rPr>
-            <w:color w:val="378ADD"/>
-            <w:sz w:val="18"/>
-            <w:szCs w:val="18"/>
-            <w:u w:val="single"/>
-          </w:rPr>
-          <w:t>github.com/ThuanNg05/AutoWashPro</w:t>
-        </w:r>
-      </w:hyperlink>
+      </w:pPr>
+      <w:r>
+        <w:t>Có nền tảng kết nối, kiểm tra máy in và các thiết bị ngoại vi; sẵn sàng học quy trình cấu hình POS, máy in hóa đơn và máy in bếp của công ty</w:t>
+      </w:r>
+    </w:p>
+    <w:p>
+      <w:pPr>
+        <w:pStyle w:val="ListParagraph"/>
+        <w:numPr>
+          <w:ilvl w:val="0"/>
+          <w:numId w:val="2"/>
+        </w:numPr>
+        <w:spacing w:after="60"/>
+      </w:pPr>
+      <w:r>
+        <w:t>Kiểm tra luồng vận hành theo checklist: đăng nhập, tạo dữ liệu cơ bản, tạo đơn, kiểm tra chức năng và bàn giao.</w:t>
+      </w:r>
+    </w:p>
+    <w:p>
+      <w:pPr>
+        <w:pStyle w:val="ListParagraph"/>
+        <w:numPr>
+          <w:ilvl w:val="0"/>
+          <w:numId w:val="2"/>
+        </w:numPr>
+        <w:spacing w:after="60"/>
+      </w:pPr>
+      <w:r>
+        <w:t>Ghi nhận lỗi có hệ thống: mô tả lỗi, thời điểm xảy ra, thiết bị liên quan, ảnh chụp và các bước đã thử xử lý.</w:t>
+      </w:r>
+    </w:p>
+    <w:p>
+      <w:pPr>
+        <w:pStyle w:val="ListParagraph"/>
+        <w:numPr>
+          <w:ilvl w:val="0"/>
+          <w:numId w:val="2"/>
+        </w:numPr>
+        <w:spacing w:after="60"/>
+      </w:pPr>
+      <w:r>
+        <w:t>Có kinh nghiệm triển khai hệ thống, cấu hình server, domain và theo dõi vận hành thực tế.</w:t>
+      </w:r>
     </w:p>
     <w:p>
       <w:pPr>
@@ -1058,7 +984,18 @@
           <w:sz w:val="18"/>
           <w:szCs w:val="18"/>
         </w:rPr>
-        <w:t xml:space="preserve">3. </w:t>
+        <w:t>4</w:t>
+      </w:r>
+      <w:r>
+        <w:rPr>
+          <w:rFonts w:ascii="Arial" w:eastAsia="Arial" w:hAnsi="Arial" w:cs="Arial"/>
+          <w:b/>
+          <w:bCs/>
+          <w:color w:val="378ADD"/>
+          <w:sz w:val="18"/>
+          <w:szCs w:val="18"/>
+        </w:rPr>
+        <w:t xml:space="preserve">. </w:t>
       </w:r>
       <w:r>
         <w:rPr>
@@ -1502,176 +1439,14 @@
     <w:p>
       <w:pPr>
         <w:pBdr>
-          <w:bottom w:val="single" w:sz="4" w:space="4" w:color="DFE7F0"/>
-        </w:pBdr>
-        <w:spacing w:before="300" w:after="160"/>
-        <w:rPr>
-          <w:sz w:val="22"/>
-          <w:szCs w:val="22"/>
-        </w:rPr>
-      </w:pPr>
-      <w:r>
-        <w:rPr>
-          <w:rFonts w:ascii="Arial" w:eastAsia="Arial" w:hAnsi="Arial" w:cs="Arial"/>
-          <w:b/>
-          <w:bCs/>
-          <w:color w:val="378ADD"/>
-          <w:sz w:val="18"/>
-          <w:szCs w:val="18"/>
-        </w:rPr>
-        <w:t xml:space="preserve">4. </w:t>
-      </w:r>
-      <w:r>
-        <w:rPr>
-          <w:rFonts w:ascii="Arial" w:eastAsia="Arial" w:hAnsi="Arial" w:cs="Arial"/>
-          <w:b/>
-          <w:bCs/>
-          <w:color w:val="042C53"/>
-          <w:spacing w:val="20"/>
-          <w:sz w:val="18"/>
-          <w:szCs w:val="18"/>
-        </w:rPr>
-        <w:t>THÀNH TÍCH</w:t>
-      </w:r>
-    </w:p>
-    <w:p>
-      <w:pPr>
-        <w:pStyle w:val="ListParagraph"/>
-        <w:numPr>
-          <w:ilvl w:val="0"/>
-          <w:numId w:val="2"/>
-        </w:numPr>
-        <w:spacing w:after="60"/>
-        <w:rPr>
-          <w:sz w:val="22"/>
-          <w:szCs w:val="22"/>
-        </w:rPr>
-      </w:pPr>
-      <w:r>
-        <w:rPr>
-          <w:b/>
-          <w:bCs/>
-          <w:color w:val="2A3A4A"/>
-          <w:sz w:val="18"/>
-          <w:szCs w:val="18"/>
-        </w:rPr>
-        <w:t xml:space="preserve">Thực tập năm 3: </w:t>
-      </w:r>
-      <w:r>
-        <w:rPr>
-          <w:color w:val="2A3A4A"/>
-          <w:sz w:val="18"/>
-          <w:szCs w:val="18"/>
-        </w:rPr>
-        <w:t>Bắt đầu thực tập tại doanh nghiệp thực tế từ năm 3, trực tiếp tham gia vận hành hệ thống production.</w:t>
-      </w:r>
-    </w:p>
-    <w:p>
-      <w:pPr>
-        <w:pStyle w:val="ListParagraph"/>
-        <w:numPr>
-          <w:ilvl w:val="0"/>
-          <w:numId w:val="2"/>
-        </w:numPr>
-        <w:spacing w:after="60"/>
-        <w:rPr>
-          <w:sz w:val="22"/>
-          <w:szCs w:val="22"/>
-        </w:rPr>
-      </w:pPr>
-      <w:r>
-        <w:rPr>
-          <w:b/>
-          <w:bCs/>
-          <w:color w:val="2A3A4A"/>
-          <w:sz w:val="18"/>
-          <w:szCs w:val="18"/>
-        </w:rPr>
-        <w:t xml:space="preserve">Lãnh đạo nhóm nghiên cứu: </w:t>
-      </w:r>
-      <w:r>
-        <w:rPr>
-          <w:color w:val="2A3A4A"/>
-          <w:sz w:val="18"/>
-          <w:szCs w:val="18"/>
-        </w:rPr>
-        <w:t xml:space="preserve">Dẫn dắt nhóm 5 thành viên với vai trò Project Lead (PL) trong dự án nghiên cứu học thuật về kiểm thử phần mềm (SWT301). Repo: </w:t>
-      </w:r>
-      <w:hyperlink r:id="rId14" w:history="1">
-        <w:r>
-          <w:rPr>
-            <w:color w:val="378ADD"/>
-            <w:sz w:val="18"/>
-            <w:szCs w:val="18"/>
-            <w:u w:val="single"/>
-          </w:rPr>
-          <w:t>github.com/NguyenHoangHuy2103/RT-SWT301-SE1916-G2</w:t>
-        </w:r>
-      </w:hyperlink>
-    </w:p>
-    <w:p>
-      <w:pPr>
-        <w:pStyle w:val="ListParagraph"/>
-        <w:numPr>
-          <w:ilvl w:val="0"/>
-          <w:numId w:val="2"/>
-        </w:numPr>
-        <w:spacing w:after="60"/>
-        <w:rPr>
-          <w:sz w:val="22"/>
-          <w:szCs w:val="22"/>
-        </w:rPr>
-      </w:pPr>
-      <w:r>
-        <w:rPr>
-          <w:b/>
-          <w:bCs/>
-          <w:color w:val="2A3A4A"/>
-          <w:sz w:val="18"/>
-          <w:szCs w:val="18"/>
-        </w:rPr>
-        <w:t xml:space="preserve">Chứng chỉ: </w:t>
-      </w:r>
-      <w:r>
-        <w:rPr>
-          <w:color w:val="2A3A4A"/>
-          <w:sz w:val="18"/>
-          <w:szCs w:val="18"/>
-        </w:rPr>
-        <w:t xml:space="preserve">Software Engineering (HKUST), Software Development Lifecycle (University of Minnesota) — Coursera</w:t>
-      </w:r>
-    </w:p>
-    <w:p>
-      <w:pPr>
-        <w:pBdr>
           <w:top w:val="single" w:sz="4" w:space="8" w:color="DFE7F0"/>
         </w:pBdr>
         <w:spacing w:before="300"/>
-        <w:jc w:val="center"/>
         <w:rPr>
           <w:sz w:val="22"/>
           <w:szCs w:val="22"/>
         </w:rPr>
       </w:pPr>
-      <w:r>
-        <w:rPr>
-          <w:color w:val="5F6B7A"/>
-          <w:sz w:val="16"/>
-          <w:szCs w:val="16"/>
-        </w:rPr>
-        <w:t xml:space="preserve">© 2026 Nguyễn Hoàng Huy · </w:t>
-      </w:r>
-      <w:hyperlink r:id="rId11" w:history="1">
-        <w:r>
-          <w:rPr>
-            <w:color w:val="378ADD"/>
-            <w:sz w:val="18"/>
-            <w:szCs w:val="18"/>
-            <w:u w:val="single"/>
-          </w:rPr>
-          <w:t>nguyenhoanghuy.io.vn</w:t>
-        </w:r>
-      </w:hyperlink>
     </w:p>
     <w:sectPr>
       <w:pgSz w:w="12240" w:h="15840"/>

</xml_diff>